<commit_message>
fix form offerta: riferimento legge, rimozione righe caricamento e revisione quando necessario, data offerta in nome file
</commit_message>
<xml_diff>
--- a/app/doc_templates/offerte/off_iper.docx
+++ b/app/doc_templates/offerte/off_iper.docx
@@ -379,7 +379,37 @@
         <w:rPr>
           <w:rFonts w:ascii="Arial" w:hAnsi="Arial" w:cs="Arial"/>
         </w:rPr>
-        <w:t>La First Engineering dispone di polizza RC Professionale n. ICIP012580 con massimale di Euro 4 milioni accesa presso AIG Europe S.A. - Rappresentanza Generale per l’Italia.</w:t>
+        <w:t>La First Engineering dispone di polizza RC Professionale n. ICI</w:t>
+      </w:r>
+      <w:r>
+        <w:rPr>
+          <w:rFonts w:ascii="Arial" w:hAnsi="Arial" w:cs="Arial"/>
+        </w:rPr>
+        <w:t xml:space="preserve">P026278 </w:t>
+      </w:r>
+      <w:r>
+        <w:rPr>
+          <w:rFonts w:ascii="Arial" w:hAnsi="Arial" w:cs="Arial"/>
+        </w:rPr>
+        <w:t xml:space="preserve">con massimale di Euro </w:t>
+      </w:r>
+      <w:r>
+        <w:rPr>
+          <w:rFonts w:ascii="Arial" w:hAnsi="Arial" w:cs="Arial"/>
+        </w:rPr>
+        <w:t>5</w:t>
+      </w:r>
+      <w:r>
+        <w:rPr>
+          <w:rFonts w:ascii="Arial" w:hAnsi="Arial" w:cs="Arial"/>
+        </w:rPr>
+        <w:t xml:space="preserve"> milioni accesa presso </w:t>
+      </w:r>
+      <w:r>
+        <w:rPr>
+          <w:rFonts w:ascii="Arial" w:hAnsi="Arial" w:cs="Arial"/>
+        </w:rPr>
+        <w:t>AON S.P.A.</w:t>
       </w:r>
     </w:p>
     <w:p>
@@ -1356,7 +1386,15 @@
           <w:sz w:val="24"/>
           <w:szCs w:val="24"/>
         </w:rPr>
-        <w:t>IV della Legge 199-25</w:t>
+        <w:t>IV della Legge 199-2</w:t>
+      </w:r>
+      <w:r>
+        <w:rPr>
+          <w:rFonts w:ascii="Arial" w:hAnsi="Arial" w:cs="Arial"/>
+          <w:sz w:val="24"/>
+          <w:szCs w:val="24"/>
+        </w:rPr>
+        <w:t>6</w:t>
       </w:r>
       <w:r>
         <w:rPr>

</xml_diff>

<commit_message>
ADD: gestione Sabatini, in inserimento lavoro, offerta, fatturazione e overlay
</commit_message>
<xml_diff>
--- a/app/doc_templates/offerte/off_iper.docx
+++ b/app/doc_templates/offerte/off_iper.docx
@@ -746,7 +746,64 @@
           <w:sz w:val="24"/>
           <w:szCs w:val="24"/>
         </w:rPr>
-        <w:t>Revisione legale (opzionale).</w:t>
+        <w:t>Revisione legale (opzionale)</w:t>
+      </w:r>
+      <w:r>
+        <w:rPr>
+          <w:rFonts w:ascii="Arial" w:hAnsi="Arial" w:cs="Arial"/>
+          <w:b/>
+          <w:bCs/>
+          <w:sz w:val="24"/>
+          <w:szCs w:val="24"/>
+        </w:rPr>
+        <w:t>;</w:t>
+      </w:r>
+    </w:p>
+    <w:p>
+      <w:pPr>
+        <w:pStyle w:val="Paragrafoelenco"/>
+        <w:numPr>
+          <w:ilvl w:val="0"/>
+          <w:numId w:val="27"/>
+        </w:numPr>
+        <w:spacing w:after="0" w:line="360" w:lineRule="auto"/>
+        <w:rPr>
+          <w:rFonts w:ascii="Arial" w:hAnsi="Arial" w:cs="Arial"/>
+          <w:b/>
+          <w:bCs/>
+          <w:sz w:val="24"/>
+          <w:szCs w:val="24"/>
+        </w:rPr>
+      </w:pPr>
+      <w:r>
+        <w:rPr>
+          <w:rFonts w:ascii="Arial" w:hAnsi="Arial" w:cs="Arial"/>
+          <w:b/>
+          <w:bCs/>
+          <w:sz w:val="24"/>
+          <w:szCs w:val="24"/>
+        </w:rPr>
+        <w:t xml:space="preserve">Gestione pratica </w:t>
+      </w:r>
+      <w:r>
+        <w:rPr>
+          <w:rFonts w:ascii="Arial" w:hAnsi="Arial" w:cs="Arial"/>
+          <w:b/>
+          <w:bCs/>
+          <w:sz w:val="24"/>
+          <w:szCs w:val="24"/>
+        </w:rPr>
+        <w:t xml:space="preserve">agevolazione </w:t>
+      </w:r>
+      <w:r>
+        <w:rPr>
+          <w:rFonts w:ascii="Arial" w:hAnsi="Arial" w:cs="Arial"/>
+          <w:b/>
+          <w:bCs/>
+          <w:sz w:val="24"/>
+          <w:szCs w:val="24"/>
+        </w:rPr>
+        <w:t>Nuova Sabatini (opzionale).</w:t>
       </w:r>
     </w:p>
     <w:p>
@@ -887,6 +944,7 @@
         <w:rPr>
           <w:rFonts w:ascii="Arial" w:hAnsi="Arial" w:cs="Arial"/>
         </w:rPr>
+        <w:lastRenderedPageBreak/>
         <w:t xml:space="preserve">La responsabilità </w:t>
       </w:r>
       <w:r>
@@ -967,14 +1025,7 @@
         <w:rPr>
           <w:rFonts w:ascii="Arial" w:hAnsi="Arial" w:cs="Arial"/>
         </w:rPr>
-        <w:t xml:space="preserve"> da eventuali danni che dovessero seguire in conseguenza </w:t>
-      </w:r>
-      <w:r>
-        <w:rPr>
-          <w:rFonts w:ascii="Arial" w:hAnsi="Arial" w:cs="Arial"/>
-        </w:rPr>
-        <w:lastRenderedPageBreak/>
-        <w:t>dei servizi oggetto della presente proposta a seguito di false e/o omesse</w:t>
+        <w:t xml:space="preserve"> da eventuali danni che dovessero seguire in conseguenza dei servizi oggetto della presente proposta a seguito di false e/o omesse</w:t>
       </w:r>
       <w:r>
         <w:rPr>
@@ -1095,7 +1146,43 @@
           <w:sz w:val="24"/>
           <w:szCs w:val="24"/>
         </w:rPr>
-        <w:t xml:space="preserve">di cui alle lettere a) e b) del precedente art. 2, </w:t>
+        <w:t xml:space="preserve">di cui alle lettere </w:t>
+      </w:r>
+      <w:r>
+        <w:rPr>
+          <w:rFonts w:ascii="Arial" w:hAnsi="Arial" w:cs="Arial"/>
+          <w:b/>
+          <w:bCs/>
+          <w:sz w:val="24"/>
+          <w:szCs w:val="24"/>
+        </w:rPr>
+        <w:t>a)</w:t>
+      </w:r>
+      <w:r>
+        <w:rPr>
+          <w:rFonts w:ascii="Arial" w:hAnsi="Arial" w:cs="Arial"/>
+          <w:sz w:val="24"/>
+          <w:szCs w:val="24"/>
+        </w:rPr>
+        <w:t xml:space="preserve"> e </w:t>
+      </w:r>
+      <w:r>
+        <w:rPr>
+          <w:rFonts w:ascii="Arial" w:hAnsi="Arial" w:cs="Arial"/>
+          <w:b/>
+          <w:bCs/>
+          <w:sz w:val="24"/>
+          <w:szCs w:val="24"/>
+        </w:rPr>
+        <w:t>b)</w:t>
+      </w:r>
+      <w:r>
+        <w:rPr>
+          <w:rFonts w:ascii="Arial" w:hAnsi="Arial" w:cs="Arial"/>
+          <w:sz w:val="24"/>
+          <w:szCs w:val="24"/>
+        </w:rPr>
+        <w:t xml:space="preserve"> del precedente art. 2, </w:t>
       </w:r>
       <w:r>
         <w:rPr>
@@ -1428,6 +1515,8 @@
       <w:r>
         <w:rPr>
           <w:rFonts w:ascii="Arial" w:hAnsi="Arial" w:cs="Arial"/>
+          <w:b/>
+          <w:bCs/>
           <w:sz w:val="24"/>
           <w:szCs w:val="24"/>
         </w:rPr>
@@ -1437,10 +1526,20 @@
       <w:r>
         <w:rPr>
           <w:rFonts w:ascii="Arial" w:hAnsi="Arial" w:cs="Arial"/>
-          <w:sz w:val="24"/>
-          <w:szCs w:val="24"/>
-        </w:rPr>
-        <w:t xml:space="preserve"> c), il costo aggiuntivo è pari a </w:t>
+          <w:b/>
+          <w:bCs/>
+          <w:sz w:val="24"/>
+          <w:szCs w:val="24"/>
+        </w:rPr>
+        <w:t xml:space="preserve"> c</w:t>
+      </w:r>
+      <w:r>
+        <w:rPr>
+          <w:rFonts w:ascii="Arial" w:hAnsi="Arial" w:cs="Arial"/>
+          <w:sz w:val="24"/>
+          <w:szCs w:val="24"/>
+        </w:rPr>
+        <w:t xml:space="preserve">), il costo aggiuntivo è pari a </w:t>
       </w:r>
       <w:r>
         <w:rPr>
@@ -1518,6 +1617,8 @@
       <w:r>
         <w:rPr>
           <w:rFonts w:ascii="Arial" w:hAnsi="Arial" w:cs="Arial"/>
+          <w:b/>
+          <w:bCs/>
           <w:sz w:val="24"/>
           <w:szCs w:val="24"/>
         </w:rPr>
@@ -1527,6 +1628,34 @@
       <w:r>
         <w:rPr>
           <w:rFonts w:ascii="Arial" w:hAnsi="Arial" w:cs="Arial"/>
+          <w:b/>
+          <w:bCs/>
+          <w:sz w:val="24"/>
+          <w:szCs w:val="24"/>
+        </w:rPr>
+        <w:t xml:space="preserve"> d</w:t>
+      </w:r>
+      <w:r>
+        <w:rPr>
+          <w:rFonts w:ascii="Arial" w:hAnsi="Arial" w:cs="Arial"/>
+          <w:sz w:val="24"/>
+          <w:szCs w:val="24"/>
+        </w:rPr>
+        <w:t xml:space="preserve">), il costo aggiuntivo è pari a </w:t>
+      </w:r>
+      <w:r>
+        <w:rPr>
+          <w:rFonts w:ascii="Arial" w:hAnsi="Arial" w:cs="Arial"/>
+          <w:b/>
+          <w:bCs/>
+          <w:sz w:val="24"/>
+          <w:szCs w:val="24"/>
+        </w:rPr>
+        <w:t>[importo revisione]</w:t>
+      </w:r>
+      <w:r>
+        <w:rPr>
+          <w:rFonts w:ascii="Arial" w:hAnsi="Arial" w:cs="Arial"/>
           <w:sz w:val="24"/>
           <w:szCs w:val="24"/>
         </w:rPr>
@@ -1535,6 +1664,44 @@
       <w:r>
         <w:rPr>
           <w:rFonts w:ascii="Arial" w:hAnsi="Arial" w:cs="Arial"/>
+          <w:b/>
+          <w:bCs/>
+          <w:sz w:val="24"/>
+          <w:szCs w:val="24"/>
+        </w:rPr>
+        <w:t>€</w:t>
+      </w:r>
+      <w:r>
+        <w:rPr>
+          <w:rFonts w:ascii="Arial" w:hAnsi="Arial" w:cs="Arial"/>
+          <w:sz w:val="24"/>
+          <w:szCs w:val="24"/>
+        </w:rPr>
+        <w:t>.</w:t>
+      </w:r>
+    </w:p>
+    <w:p>
+      <w:pPr>
+        <w:pStyle w:val="Standard"/>
+        <w:spacing w:line="360" w:lineRule="auto"/>
+        <w:jc w:val="both"/>
+        <w:rPr>
+          <w:rFonts w:ascii="Arial" w:hAnsi="Arial" w:cs="Arial"/>
+          <w:sz w:val="24"/>
+          <w:szCs w:val="24"/>
+        </w:rPr>
+      </w:pPr>
+      <w:r>
+        <w:rPr>
+          <w:rFonts w:ascii="Arial" w:hAnsi="Arial" w:cs="Arial"/>
+          <w:sz w:val="24"/>
+          <w:szCs w:val="24"/>
+        </w:rPr>
+        <w:t xml:space="preserve">Nel caso di richiesta </w:t>
+      </w:r>
+      <w:r>
+        <w:rPr>
+          <w:rFonts w:ascii="Arial" w:hAnsi="Arial" w:cs="Arial"/>
           <w:sz w:val="24"/>
           <w:szCs w:val="24"/>
         </w:rPr>
@@ -1546,6 +1713,54 @@
           <w:sz w:val="24"/>
           <w:szCs w:val="24"/>
         </w:rPr>
+        <w:t>i gestione della pratica Nuova Sabatini</w:t>
+      </w:r>
+      <w:r>
+        <w:rPr>
+          <w:rFonts w:ascii="Arial" w:hAnsi="Arial" w:cs="Arial"/>
+          <w:sz w:val="24"/>
+          <w:szCs w:val="24"/>
+        </w:rPr>
+        <w:t xml:space="preserve"> (</w:t>
+      </w:r>
+      <w:proofErr w:type="spellStart"/>
+      <w:r>
+        <w:rPr>
+          <w:rFonts w:ascii="Arial" w:hAnsi="Arial" w:cs="Arial"/>
+          <w:b/>
+          <w:bCs/>
+          <w:sz w:val="24"/>
+          <w:szCs w:val="24"/>
+        </w:rPr>
+        <w:t>pto</w:t>
+      </w:r>
+      <w:proofErr w:type="spellEnd"/>
+      <w:r>
+        <w:rPr>
+          <w:rFonts w:ascii="Arial" w:hAnsi="Arial" w:cs="Arial"/>
+          <w:b/>
+          <w:bCs/>
+          <w:sz w:val="24"/>
+          <w:szCs w:val="24"/>
+        </w:rPr>
+        <w:t xml:space="preserve"> </w:t>
+      </w:r>
+      <w:r>
+        <w:rPr>
+          <w:rFonts w:ascii="Arial" w:hAnsi="Arial" w:cs="Arial"/>
+          <w:b/>
+          <w:bCs/>
+          <w:sz w:val="24"/>
+          <w:szCs w:val="24"/>
+        </w:rPr>
+        <w:t>e</w:t>
+      </w:r>
+      <w:r>
+        <w:rPr>
+          <w:rFonts w:ascii="Arial" w:hAnsi="Arial" w:cs="Arial"/>
+          <w:sz w:val="24"/>
+          <w:szCs w:val="24"/>
+        </w:rPr>
         <w:t xml:space="preserve">), il costo aggiuntivo è pari a </w:t>
       </w:r>
       <w:r>
@@ -1556,7 +1771,27 @@
           <w:sz w:val="24"/>
           <w:szCs w:val="24"/>
         </w:rPr>
-        <w:t>[importo revisione]</w:t>
+        <w:t xml:space="preserve">[importo </w:t>
+      </w:r>
+      <w:r>
+        <w:rPr>
+          <w:rFonts w:ascii="Arial" w:hAnsi="Arial" w:cs="Arial"/>
+          <w:b/>
+          <w:bCs/>
+          <w:sz w:val="24"/>
+          <w:szCs w:val="24"/>
+        </w:rPr>
+        <w:t>sabatini</w:t>
+      </w:r>
+      <w:r>
+        <w:rPr>
+          <w:rFonts w:ascii="Arial" w:hAnsi="Arial" w:cs="Arial"/>
+          <w:b/>
+          <w:bCs/>
+          <w:sz w:val="24"/>
+          <w:szCs w:val="24"/>
+        </w:rPr>
+        <w:t>]</w:t>
       </w:r>
       <w:r>
         <w:rPr>
@@ -1575,6 +1810,24 @@
           <w:szCs w:val="24"/>
         </w:rPr>
         <w:t>€</w:t>
+      </w:r>
+      <w:r>
+        <w:rPr>
+          <w:rFonts w:ascii="Arial" w:hAnsi="Arial" w:cs="Arial"/>
+          <w:b/>
+          <w:bCs/>
+          <w:sz w:val="24"/>
+          <w:szCs w:val="24"/>
+        </w:rPr>
+        <w:t xml:space="preserve"> </w:t>
+      </w:r>
+      <w:r>
+        <w:rPr>
+          <w:rFonts w:ascii="Arial" w:hAnsi="Arial" w:cs="Arial"/>
+          <w:sz w:val="24"/>
+          <w:szCs w:val="24"/>
+        </w:rPr>
+        <w:t>(per la domanda iniziale e per l’attività di rendicontazione)</w:t>
       </w:r>
       <w:r>
         <w:rPr>
@@ -1735,14 +1988,14 @@
         <w:rPr>
           <w:rFonts w:ascii="Arial" w:hAnsi="Arial" w:cs="Arial"/>
         </w:rPr>
-        <w:t xml:space="preserve">Le parti si impegnano a non utilizzare, né in tutto né in parte, le informazioni riservate, di cui verranno a conoscenza, per fini diversi da quanto costituisce oggetto dell’attività di consulenza derivante dal presente accordo; si impegnano inoltre a non divulgare e/o comunicare a terzi, né in tutto né in parte, né in forma scritta né orale o grafica o su supporto magnetico o in qualsiasi altra forma, le suddette informazioni riservate senza il preventivo </w:t>
+        <w:t xml:space="preserve">Le parti si impegnano a non utilizzare, né in tutto né in parte, le informazioni riservate, di cui verranno a conoscenza, per fini diversi da quanto costituisce oggetto dell’attività di </w:t>
       </w:r>
       <w:r>
         <w:rPr>
           <w:rFonts w:ascii="Arial" w:hAnsi="Arial" w:cs="Arial"/>
         </w:rPr>
         <w:lastRenderedPageBreak/>
-        <w:t xml:space="preserve">ed espresso consenso dell’altra parte. La Società autorizza </w:t>
+        <w:t xml:space="preserve">consulenza derivante dal presente accordo; si impegnano inoltre a non divulgare e/o comunicare a terzi, né in tutto né in parte, né in forma scritta né orale o grafica o su supporto magnetico o in qualsiasi altra forma, le suddette informazioni riservate senza il preventivo ed espresso consenso dell’altra parte. La Società autorizza </w:t>
       </w:r>
       <w:r>
         <w:rPr>
@@ -1819,7 +2072,6 @@
     <w:p>
       <w:pPr>
         <w:spacing w:line="276" w:lineRule="auto"/>
-        <w:jc w:val="center"/>
         <w:rPr>
           <w:rFonts w:ascii="Arial" w:hAnsi="Arial" w:cs="Arial"/>
         </w:rPr>
@@ -1842,30 +2094,12 @@
           <w:rFonts w:ascii="Arial" w:hAnsi="Arial" w:cs="Arial"/>
         </w:rPr>
       </w:pPr>
-    </w:p>
-    <w:p>
-      <w:pPr>
-        <w:spacing w:line="276" w:lineRule="auto"/>
-        <w:jc w:val="center"/>
-        <w:rPr>
-          <w:rFonts w:ascii="Arial" w:hAnsi="Arial" w:cs="Arial"/>
-        </w:rPr>
-      </w:pPr>
       <w:r>
         <w:rPr>
           <w:rFonts w:ascii="Arial" w:hAnsi="Arial" w:cs="Arial"/>
         </w:rPr>
         <w:t>* * *</w:t>
       </w:r>
-    </w:p>
-    <w:p>
-      <w:pPr>
-        <w:spacing w:line="276" w:lineRule="auto"/>
-        <w:jc w:val="both"/>
-        <w:rPr>
-          <w:rFonts w:ascii="Arial" w:hAnsi="Arial" w:cs="Arial"/>
-        </w:rPr>
-      </w:pPr>
     </w:p>
     <w:p>
       <w:pPr>
@@ -2336,6 +2570,117 @@
           <w:szCs w:val="24"/>
         </w:rPr>
       </w:pPr>
+      <w:r>
+        <w:rPr>
+          <w:rFonts w:ascii="Arial" w:hAnsi="Arial" w:cs="Arial"/>
+          <w:b/>
+          <w:color w:val="000000"/>
+          <w:spacing w:val="-2"/>
+          <w:sz w:val="24"/>
+          <w:szCs w:val="24"/>
+        </w:rPr>
+        <w:sym w:font="Wingdings" w:char="F0A8"/>
+      </w:r>
+      <w:r>
+        <w:rPr>
+          <w:rFonts w:ascii="Arial" w:hAnsi="Arial" w:cs="Arial"/>
+          <w:b/>
+          <w:color w:val="000000"/>
+          <w:spacing w:val="-2"/>
+          <w:sz w:val="24"/>
+          <w:szCs w:val="24"/>
+        </w:rPr>
+        <w:t xml:space="preserve"> </w:t>
+      </w:r>
+      <w:r>
+        <w:rPr>
+          <w:rFonts w:ascii="Arial" w:hAnsi="Arial" w:cs="Arial"/>
+          <w:b/>
+          <w:color w:val="000000"/>
+          <w:spacing w:val="-2"/>
+          <w:sz w:val="24"/>
+          <w:szCs w:val="24"/>
+        </w:rPr>
+        <w:t xml:space="preserve">barrare se interessati anche al </w:t>
+      </w:r>
+      <w:proofErr w:type="spellStart"/>
+      <w:r>
+        <w:rPr>
+          <w:rFonts w:ascii="Arial" w:hAnsi="Arial" w:cs="Arial"/>
+          <w:b/>
+          <w:color w:val="000000"/>
+          <w:spacing w:val="-2"/>
+          <w:sz w:val="24"/>
+          <w:szCs w:val="24"/>
+        </w:rPr>
+        <w:t>pto</w:t>
+      </w:r>
+      <w:proofErr w:type="spellEnd"/>
+      <w:r>
+        <w:rPr>
+          <w:rFonts w:ascii="Arial" w:hAnsi="Arial" w:cs="Arial"/>
+          <w:b/>
+          <w:color w:val="000000"/>
+          <w:spacing w:val="-2"/>
+          <w:sz w:val="24"/>
+          <w:szCs w:val="24"/>
+        </w:rPr>
+        <w:t xml:space="preserve"> </w:t>
+      </w:r>
+      <w:r>
+        <w:rPr>
+          <w:rFonts w:ascii="Arial" w:hAnsi="Arial" w:cs="Arial"/>
+          <w:b/>
+          <w:color w:val="000000"/>
+          <w:spacing w:val="-2"/>
+          <w:sz w:val="24"/>
+          <w:szCs w:val="24"/>
+        </w:rPr>
+        <w:t>e</w:t>
+      </w:r>
+      <w:r>
+        <w:rPr>
+          <w:rFonts w:ascii="Arial" w:hAnsi="Arial" w:cs="Arial"/>
+          <w:b/>
+          <w:color w:val="000000"/>
+          <w:spacing w:val="-2"/>
+          <w:sz w:val="24"/>
+          <w:szCs w:val="24"/>
+        </w:rPr>
+        <w:t xml:space="preserve">) – </w:t>
+      </w:r>
+      <w:r>
+        <w:rPr>
+          <w:rFonts w:ascii="Arial" w:hAnsi="Arial" w:cs="Arial"/>
+          <w:b/>
+          <w:color w:val="000000"/>
+          <w:spacing w:val="-2"/>
+          <w:sz w:val="24"/>
+          <w:szCs w:val="24"/>
+        </w:rPr>
+        <w:t>Gestione pratica Nuova Sabatini</w:t>
+      </w:r>
+    </w:p>
+    <w:p>
+      <w:pPr>
+        <w:pStyle w:val="Style1"/>
+        <w:tabs>
+          <w:tab w:val="center" w:pos="1701"/>
+          <w:tab w:val="center" w:pos="7938"/>
+        </w:tabs>
+        <w:kinsoku w:val="0"/>
+        <w:autoSpaceDE/>
+        <w:autoSpaceDN/>
+        <w:adjustRightInd/>
+        <w:rPr>
+          <w:rFonts w:ascii="Arial" w:hAnsi="Arial" w:cs="Arial"/>
+          <w:b/>
+          <w:color w:val="000000"/>
+          <w:spacing w:val="-2"/>
+          <w:sz w:val="24"/>
+          <w:szCs w:val="24"/>
+        </w:rPr>
+      </w:pPr>
     </w:p>
     <w:p>
       <w:pPr>
@@ -2419,20 +2764,6 @@
         </w:rPr>
         <w:t xml:space="preserve"> </w:t>
       </w:r>
-    </w:p>
-    <w:p>
-      <w:pPr>
-        <w:spacing w:line="276" w:lineRule="auto"/>
-        <w:rPr>
-          <w:rStyle w:val="CharacterStyle2"/>
-          <w:rFonts w:ascii="Arial" w:hAnsi="Arial"/>
-          <w:b w:val="0"/>
-          <w:bCs/>
-          <w:color w:val="000000"/>
-          <w:spacing w:val="-2"/>
-          <w:sz w:val="24"/>
-        </w:rPr>
-      </w:pPr>
     </w:p>
     <w:p>
       <w:pPr>

</xml_diff>